<commit_message>
Sync automático Mac → nube: 5 archivo(s) de memoria/vault/comandos
</commit_message>
<xml_diff>
--- a/vault/proyectos/estudio/Guiones-Ritz-3-videos.docx
+++ b/vault/proyectos/estudio/Guiones-Ritz-3-videos.docx
@@ -171,7 +171,23 @@
           <w:sz w:val="28"/>
           <w:szCs w:val="28"/>
         </w:rPr>
-        <w:t xml:space="preserve">Varias empresas, en silencio. Una agencia que hoy factura más de cien mil dólares al mes. Y casi nadie sabía quién era.</w:t>
+        <w:t xml:space="preserve">Esa estrategia ha generado más de cinco millones de dólares en ventas: dos millones y medio en mis propios negocios, y dos millones y medio para mis clientes.</w:t>
+      </w:r>
+    </w:p>
+    <w:p>
+      <w:pPr>
+        <w:spacing w:after="140" w:line="340"/>
+      </w:pPr>
+      <w:r>
+        <w:rPr>
+          <w:rFonts w:ascii="Calibri" w:cs="Calibri" w:eastAsia="Calibri" w:hAnsi="Calibri"/>
+          <w:b w:val="false"/>
+          <w:bCs w:val="false"/>
+          <w:color w:val="000000"/>
+          <w:sz w:val="28"/>
+          <w:szCs w:val="28"/>
+        </w:rPr>
+        <w:t xml:space="preserve">Todo en silencio, y casi nadie sabía quién era.</w:t>
       </w:r>
     </w:p>
     <w:p>
@@ -2711,6 +2727,22 @@
           <w:szCs w:val="28"/>
         </w:rPr>
         <w:t xml:space="preserve">Y hasta hoy, más de doscientos cincuenta negocios en Puerto Rico han escalado con mi estrategia. Con mi embudo de marketing. Mi agencia usa mi método, y directamente ha ayudado a cientos de negocios a crecer.</w:t>
+      </w:r>
+    </w:p>
+    <w:p>
+      <w:pPr>
+        <w:spacing w:after="140" w:line="340"/>
+      </w:pPr>
+      <w:r>
+        <w:rPr>
+          <w:rFonts w:ascii="Calibri" w:cs="Calibri" w:eastAsia="Calibri" w:hAnsi="Calibri"/>
+          <w:b w:val="false"/>
+          <w:bCs w:val="false"/>
+          <w:color w:val="000000"/>
+          <w:sz w:val="28"/>
+          <w:szCs w:val="28"/>
+        </w:rPr>
+        <w:t xml:space="preserve">En total, esa estrategia ha generado más de cinco millones de dólares en ventas: dos millones y medio en mis propios negocios, y dos millones y medio para mis clientes.</w:t>
       </w:r>
     </w:p>
     <w:p>

</xml_diff>